<commit_message>
vault backup: 2026-04-16 14:45:25
</commit_message>
<xml_diff>
--- a/123_formatted.docx
+++ b/123_formatted.docx
@@ -8411,6 +8411,7 @@
       <w:footnotePr>
         <w:numRestart w:val="eachSect"/>
       </w:footnotePr>
+      <w:pgMar w:bottom="1440" w:left="1797" w:right="1797" w:top="1440"/>
     </w:sectPr>
   </w:body>
 </w:document>
@@ -8807,6 +8808,13 @@
   <w:style w:default="1" w:styleId="Normal" w:type="paragraph">
     <w:name w:val="Normal"/>
     <w:qFormat/>
+    <w:pPr>
+      <w:spacing w:after="120" w:line="360" w:lineRule="auto"/>
+    </w:pPr>
+    <w:rPr>
+      <w:rFonts w:ascii="Times New Roman" w:eastAsia="宋体" w:hAnsi="Times New Roman"/>
+      <w:sz w:val="22"/>
+    </w:rPr>
   </w:style>
   <w:style w:styleId="BodyText" w:type="paragraph">
     <w:name w:val="Body Text"/>
@@ -8822,6 +8830,13 @@
     <w:basedOn w:val="BodyText"/>
     <w:next w:val="BodyText"/>
     <w:qFormat/>
+    <w:pPr>
+      <w:spacing w:after="120" w:line="360" w:lineRule="auto"/>
+    </w:pPr>
+    <w:rPr>
+      <w:rFonts w:ascii="Times New Roman" w:eastAsia="宋体" w:hAnsi="Times New Roman"/>
+      <w:sz w:val="22"/>
+    </w:rPr>
   </w:style>
   <w:style w:customStyle="1" w:styleId="Compact" w:type="paragraph">
     <w:name w:val="Compact"/>
@@ -8845,8 +8860,9 @@
       <w:jc w:val="center"/>
     </w:pPr>
     <w:rPr>
-      <w:rFonts w:asciiTheme="majorHAnsi" w:cstheme="majorBidi" w:eastAsiaTheme="majorEastAsia" w:hAnsiTheme="majorHAnsi"/>
-      <w:sz w:val="56"/>
+      <w:rFonts w:ascii="Times New Roman" w:asciiTheme="majorHAnsi" w:cstheme="majorBidi" w:eastAsia="宋体" w:eastAsiaTheme="majorEastAsia" w:hAnsi="Times New Roman" w:hAnsiTheme="majorHAnsi"/>
+      <w:b/>
+      <w:sz w:val="44"/>
       <w:szCs w:val="56"/>
     </w:rPr>
   </w:style>
@@ -8975,13 +8991,14 @@
     <w:pPr>
       <w:keepNext/>
       <w:keepLines/>
-      <w:spacing w:after="80" w:before="360"/>
+      <w:spacing w:after="200" w:before="360"/>
       <w:outlineLvl w:val="0"/>
     </w:pPr>
     <w:rPr>
-      <w:rFonts w:asciiTheme="majorHAnsi" w:cstheme="majorBidi" w:eastAsiaTheme="majorEastAsia" w:hAnsiTheme="majorHAnsi"/>
+      <w:rFonts w:ascii="Times New Roman" w:asciiTheme="majorHAnsi" w:cstheme="majorBidi" w:eastAsia="宋体" w:eastAsiaTheme="majorEastAsia" w:hAnsi="Times New Roman" w:hAnsiTheme="majorHAnsi"/>
+      <w:b/>
       <w:color w:themeColor="accent1" w:themeShade="BF" w:val="0F4761"/>
-      <w:sz w:val="40"/>
+      <w:sz w:val="32"/>
       <w:szCs w:val="40"/>
     </w:rPr>
   </w:style>
@@ -8998,13 +9015,14 @@
     <w:pPr>
       <w:keepNext/>
       <w:keepLines/>
-      <w:spacing w:after="80" w:before="160"/>
+      <w:spacing w:after="160" w:before="280"/>
       <w:outlineLvl w:val="1"/>
     </w:pPr>
     <w:rPr>
-      <w:rFonts w:asciiTheme="majorHAnsi" w:cstheme="majorBidi" w:eastAsiaTheme="majorEastAsia" w:hAnsiTheme="majorHAnsi"/>
+      <w:rFonts w:ascii="Times New Roman" w:asciiTheme="majorHAnsi" w:cstheme="majorBidi" w:eastAsia="宋体" w:eastAsiaTheme="majorEastAsia" w:hAnsi="Times New Roman" w:hAnsiTheme="majorHAnsi"/>
+      <w:b/>
       <w:color w:themeColor="accent1" w:themeShade="BF" w:val="0F4761"/>
-      <w:sz w:val="32"/>
+      <w:sz w:val="28"/>
       <w:szCs w:val="32"/>
     </w:rPr>
   </w:style>
@@ -9021,13 +9039,14 @@
     <w:pPr>
       <w:keepNext/>
       <w:keepLines/>
-      <w:spacing w:after="80" w:before="160"/>
+      <w:spacing w:after="120" w:before="200"/>
       <w:outlineLvl w:val="2"/>
     </w:pPr>
     <w:rPr>
-      <w:rFonts w:cstheme="majorBidi" w:eastAsiaTheme="majorEastAsia"/>
+      <w:rFonts w:ascii="Times New Roman" w:cstheme="majorBidi" w:eastAsia="宋体" w:eastAsiaTheme="majorEastAsia" w:hAnsi="Times New Roman"/>
+      <w:b/>
       <w:color w:themeColor="accent1" w:themeShade="BF" w:val="0F4761"/>
-      <w:sz w:val="28"/>
+      <w:sz w:val="24"/>
       <w:szCs w:val="28"/>
     </w:rPr>
   </w:style>

</xml_diff>